<commit_message>
fix: blindar tool salvar_lead com campos obrigatorios, recuperar dados do historico e sincronizar notificacao telegram
</commit_message>
<xml_diff>
--- a/RELATORIO_ENTREGA.docx
+++ b/RELATORIO_ENTREGA.docx
@@ -393,7 +393,7 @@
             </w:tcMar>
           </w:tcPr>
           <w:p>
-            <w:hyperlink w:history="1" r:id="rIdp8_af3bg31btawywwaope">
+            <w:hyperlink w:history="1" r:id="rIdhi2r99yamezjs9tfkwely">
               <w:r>
                 <w:rPr>
                   <w:rFonts w:ascii="Segoe UI" w:cs="Segoe UI" w:eastAsia="Segoe UI" w:hAnsi="Segoe UI"/>
@@ -490,7 +490,7 @@
             </w:tcMar>
           </w:tcPr>
           <w:p>
-            <w:hyperlink w:history="1" r:id="rIdokyixeu6-nrd4wcksaqwh">
+            <w:hyperlink w:history="1" r:id="rIdj4nyrauwxbqgwag8rk7_v">
               <w:r>
                 <w:rPr>
                   <w:rFonts w:ascii="Segoe UI" w:cs="Segoe UI" w:eastAsia="Segoe UI" w:hAnsi="Segoe UI"/>
@@ -586,7 +586,7 @@
             </w:tcMar>
           </w:tcPr>
           <w:p>
-            <w:hyperlink w:history="1" r:id="rIdqgzpswrq9qsofg_7mildn">
+            <w:hyperlink w:history="1" r:id="rIdeacunddekwuv0qemazpl8">
               <w:r>
                 <w:rPr>
                   <w:rFonts w:ascii="Segoe UI" w:cs="Segoe UI" w:eastAsia="Segoe UI" w:hAnsi="Segoe UI"/>
@@ -691,7 +691,7 @@
             </w:tcMar>
           </w:tcPr>
           <w:p>
-            <w:hyperlink w:history="1" r:id="rIdmy1jogr6sf1axa8pbjdek">
+            <w:hyperlink w:history="1" r:id="rId3txdhx1thwakswihf6b5t">
               <w:r>
                 <w:rPr>
                   <w:rFonts w:ascii="Segoe UI" w:cs="Segoe UI" w:eastAsia="Segoe UI" w:hAnsi="Segoe UI"/>

</xml_diff>

<commit_message>
fix(security): implement SAST hardening across auth, RLS and edge functions (A1-A7)
</commit_message>
<xml_diff>
--- a/RELATORIO_ENTREGA.docx
+++ b/RELATORIO_ENTREGA.docx
@@ -282,7 +282,7 @@
             <w:vAlign w:val="center"/>
           </w:tcPr>
           <w:p>
-            <w:hyperlink w:history="1" r:id="rIdzc3ggogxlalqcolgq01fw">
+            <w:hyperlink w:history="1" r:id="rIdymea9pjjksfhtjj5v2ebe">
               <w:r>
                 <w:rPr>
                   <w:rFonts w:ascii="Segoe UI" w:cs="Segoe UI" w:eastAsia="Segoe UI" w:hAnsi="Segoe UI"/>
@@ -359,7 +359,7 @@
             <w:vAlign w:val="center"/>
           </w:tcPr>
           <w:p>
-            <w:hyperlink w:history="1" r:id="rIdscugc5by3qwevlvsjkrl5">
+            <w:hyperlink w:history="1" r:id="rIdt3iyqwtcm__kcrjpc_tfo">
               <w:r>
                 <w:rPr>
                   <w:rFonts w:ascii="Segoe UI" w:cs="Segoe UI" w:eastAsia="Segoe UI" w:hAnsi="Segoe UI"/>
@@ -378,47 +378,7 @@
                 <w:sz w:val="18"/>
                 <w:szCs w:val="18"/>
               </w:rPr>
-              <w:t xml:space="preserve"> (Credenciais: Usuário </w:t>
-            </w:r>
-            <w:r>
-              <w:rPr>
-                <w:rFonts w:ascii="Segoe UI" w:cs="Segoe UI" w:eastAsia="Segoe UI" w:hAnsi="Segoe UI"/>
-                <w:b/>
-                <w:bCs/>
-                <w:color w:val="003366"/>
-                <w:sz w:val="18"/>
-                <w:szCs w:val="18"/>
-              </w:rPr>
-              <w:t xml:space="preserve">admin</w:t>
-            </w:r>
-            <w:r>
-              <w:rPr>
-                <w:rFonts w:ascii="Segoe UI" w:cs="Segoe UI" w:eastAsia="Segoe UI" w:hAnsi="Segoe UI"/>
-                <w:color w:val="4B5563"/>
-                <w:sz w:val="18"/>
-                <w:szCs w:val="18"/>
-              </w:rPr>
-              <w:t xml:space="preserve"> | Senha </w:t>
-            </w:r>
-            <w:r>
-              <w:rPr>
-                <w:rFonts w:ascii="Segoe UI" w:cs="Segoe UI" w:eastAsia="Segoe UI" w:hAnsi="Segoe UI"/>
-                <w:b/>
-                <w:bCs/>
-                <w:color w:val="003366"/>
-                <w:sz w:val="18"/>
-                <w:szCs w:val="18"/>
-              </w:rPr>
-              <w:t xml:space="preserve">admin</w:t>
-            </w:r>
-            <w:r>
-              <w:rPr>
-                <w:rFonts w:ascii="Segoe UI" w:cs="Segoe UI" w:eastAsia="Segoe UI" w:hAnsi="Segoe UI"/>
-                <w:color w:val="4B5563"/>
-                <w:sz w:val="18"/>
-                <w:szCs w:val="18"/>
-              </w:rPr>
-              <w:t xml:space="preserve">)</w:t>
+              <w:t xml:space="preserve"> (Acesso restrito autenticado via Supabase Auth RBAC)</w:t>
             </w:r>
           </w:p>
         </w:tc>
@@ -476,7 +436,7 @@
             <w:vAlign w:val="center"/>
           </w:tcPr>
           <w:p>
-            <w:hyperlink w:history="1" r:id="rIdceowfdnetjopqvyn10w7j">
+            <w:hyperlink w:history="1" r:id="rIdcsrptpg-y6yk86z9mf3ct">
               <w:r>
                 <w:rPr>
                   <w:rFonts w:ascii="Segoe UI" w:cs="Segoe UI" w:eastAsia="Segoe UI" w:hAnsi="Segoe UI"/>
@@ -553,7 +513,7 @@
             <w:vAlign w:val="center"/>
           </w:tcPr>
           <w:p>
-            <w:hyperlink w:history="1" r:id="rId1o1z4eymidewaoslvs2wn">
+            <w:hyperlink w:history="1" r:id="rIdtifox3lxgk3ngfwjwdzhd">
               <w:r>
                 <w:rPr>
                   <w:rFonts w:ascii="Segoe UI" w:cs="Segoe UI" w:eastAsia="Segoe UI" w:hAnsi="Segoe UI"/>
@@ -2777,7 +2737,7 @@
           <w:sz w:val="21"/>
           <w:szCs w:val="21"/>
         </w:rPr>
-        <w:t xml:space="preserve">Acesse https://orcamento-na-hora.pages.dev/admin.html. Na tela de login, insira usuário "admin" e senha "admin". Verifique a consolidação dos KPIs em tempo real (Faturamento, Ticket Médio e Total de Leads) e acione o botão com link direto para o WhatsApp.</w:t>
+        <w:t xml:space="preserve">Acesse https://orcamento-na-hora.pages.dev/admin.html. Na tela de login, autentique-se com seu e-mail e senha corporativa via Supabase Auth. Verifique a consolidação dos KPIs em tempo real (Faturamento, Ticket Médio e Total de Leads) e acione o botão com link direto para o WhatsApp.</w:t>
       </w:r>
     </w:p>
     <w:p>

</xml_diff>